<commit_message>
Actualizo la documentación y evidencias
</commit_message>
<xml_diff>
--- a/evidencias/evidencias.docx
+++ b/evidencias/evidencias.docx
@@ -4,6 +4,9 @@
   <w:body>
     <w:p>
       <w:r>
+        <w:rPr>
+          <w:noProof/>
+        </w:rPr>
         <w:drawing>
           <wp:inline distT="0" distB="0" distL="0" distR="0" wp14:anchorId="58272148" wp14:editId="2F81E579">
             <wp:extent cx="5425910" cy="5395428"/>
@@ -43,6 +46,9 @@
     </w:p>
     <w:p>
       <w:r>
+        <w:rPr>
+          <w:noProof/>
+        </w:rPr>
         <w:lastRenderedPageBreak/>
         <w:drawing>
           <wp:inline distT="0" distB="0" distL="0" distR="0" wp14:anchorId="16254E3E" wp14:editId="18C93B10">
@@ -83,6 +89,9 @@
     </w:p>
     <w:p>
       <w:r>
+        <w:rPr>
+          <w:noProof/>
+        </w:rPr>
         <w:drawing>
           <wp:inline distT="0" distB="0" distL="0" distR="0" wp14:anchorId="5BDE1907" wp14:editId="40740D9F">
             <wp:extent cx="5612130" cy="3864610"/>
@@ -122,6 +131,9 @@
     </w:p>
     <w:p>
       <w:r>
+        <w:rPr>
+          <w:noProof/>
+        </w:rPr>
         <w:lastRenderedPageBreak/>
         <w:drawing>
           <wp:inline distT="0" distB="0" distL="0" distR="0" wp14:anchorId="23DD1310" wp14:editId="63C201BA">
@@ -162,6 +174,9 @@
     </w:p>
     <w:p>
       <w:r>
+        <w:rPr>
+          <w:noProof/>
+        </w:rPr>
         <w:lastRenderedPageBreak/>
         <w:drawing>
           <wp:inline distT="0" distB="0" distL="0" distR="0" wp14:anchorId="534AEFA2" wp14:editId="684CA268">
@@ -202,6 +217,9 @@
     </w:p>
     <w:p>
       <w:r>
+        <w:rPr>
+          <w:noProof/>
+        </w:rPr>
         <w:drawing>
           <wp:inline distT="0" distB="0" distL="0" distR="0" wp14:anchorId="2640A150" wp14:editId="0209E74D">
             <wp:extent cx="5612130" cy="3753485"/>
@@ -241,6 +259,9 @@
     </w:p>
     <w:p>
       <w:r>
+        <w:rPr>
+          <w:noProof/>
+        </w:rPr>
         <w:lastRenderedPageBreak/>
         <w:drawing>
           <wp:inline distT="0" distB="0" distL="0" distR="0" wp14:anchorId="5A9BD679" wp14:editId="0B0FC25C">
@@ -278,12 +299,18 @@
           </wp:inline>
         </w:drawing>
       </w:r>
+    </w:p>
+    <w:p>
       <w:r>
+        <w:rPr>
+          <w:noProof/>
+        </w:rPr>
+        <w:lastRenderedPageBreak/>
         <w:drawing>
-          <wp:inline distT="0" distB="0" distL="0" distR="0" wp14:anchorId="1DF929A2" wp14:editId="00911905">
-            <wp:extent cx="5612130" cy="4178300"/>
+          <wp:inline distT="0" distB="0" distL="0" distR="0" wp14:anchorId="380FFEBC" wp14:editId="60665D3E">
+            <wp:extent cx="5612130" cy="3642995"/>
             <wp:effectExtent l="0" t="0" r="7620" b="0"/>
-            <wp:docPr id="9" name="Imagen 9"/>
+            <wp:docPr id="10" name="Imagen 10"/>
             <wp:cNvGraphicFramePr>
               <a:graphicFrameLocks xmlns:a="http://schemas.openxmlformats.org/drawingml/2006/main" noChangeAspect="1"/>
             </wp:cNvGraphicFramePr>
@@ -303,7 +330,7 @@
                   <pic:spPr>
                     <a:xfrm>
                       <a:off x="0" y="0"/>
-                      <a:ext cx="5612130" cy="4178300"/>
+                      <a:ext cx="5612130" cy="3642995"/>
                     </a:xfrm>
                     <a:prstGeom prst="rect">
                       <a:avLst/>
@@ -315,15 +342,12 @@
           </wp:inline>
         </w:drawing>
       </w:r>
-    </w:p>
-    <w:p>
       <w:r>
-        <w:lastRenderedPageBreak/>
         <w:drawing>
-          <wp:inline distT="0" distB="0" distL="0" distR="0" wp14:anchorId="380FFEBC" wp14:editId="60665D3E">
-            <wp:extent cx="5612130" cy="3642995"/>
-            <wp:effectExtent l="0" t="0" r="7620" b="0"/>
-            <wp:docPr id="10" name="Imagen 10"/>
+          <wp:inline distT="0" distB="0" distL="0" distR="0" wp14:anchorId="53D25A6D" wp14:editId="284F686E">
+            <wp:extent cx="5612130" cy="4566285"/>
+            <wp:effectExtent l="0" t="0" r="7620" b="5715"/>
+            <wp:docPr id="12" name="Imagen 12"/>
             <wp:cNvGraphicFramePr>
               <a:graphicFrameLocks xmlns:a="http://schemas.openxmlformats.org/drawingml/2006/main" noChangeAspect="1"/>
             </wp:cNvGraphicFramePr>
@@ -343,7 +367,7 @@
                   <pic:spPr>
                     <a:xfrm>
                       <a:off x="0" y="0"/>
-                      <a:ext cx="5612130" cy="3642995"/>
+                      <a:ext cx="5612130" cy="4566285"/>
                     </a:xfrm>
                     <a:prstGeom prst="rect">
                       <a:avLst/>
@@ -358,11 +382,12 @@
     </w:p>
     <w:p>
       <w:r>
+        <w:lastRenderedPageBreak/>
         <w:drawing>
-          <wp:inline distT="0" distB="0" distL="0" distR="0" wp14:anchorId="1226176F" wp14:editId="46A0B9A6">
-            <wp:extent cx="5612130" cy="2920365"/>
-            <wp:effectExtent l="0" t="0" r="7620" b="0"/>
-            <wp:docPr id="11" name="Imagen 11"/>
+          <wp:inline distT="0" distB="0" distL="0" distR="0" wp14:anchorId="1C3D6B98" wp14:editId="466AED4B">
+            <wp:extent cx="5612130" cy="3077845"/>
+            <wp:effectExtent l="0" t="0" r="7620" b="8255"/>
+            <wp:docPr id="13" name="Imagen 13"/>
             <wp:cNvGraphicFramePr>
               <a:graphicFrameLocks xmlns:a="http://schemas.openxmlformats.org/drawingml/2006/main" noChangeAspect="1"/>
             </wp:cNvGraphicFramePr>
@@ -382,7 +407,46 @@
                   <pic:spPr>
                     <a:xfrm>
                       <a:off x="0" y="0"/>
-                      <a:ext cx="5612130" cy="2920365"/>
+                      <a:ext cx="5612130" cy="3077845"/>
+                    </a:xfrm>
+                    <a:prstGeom prst="rect">
+                      <a:avLst/>
+                    </a:prstGeom>
+                  </pic:spPr>
+                </pic:pic>
+              </a:graphicData>
+            </a:graphic>
+          </wp:inline>
+        </w:drawing>
+      </w:r>
+    </w:p>
+    <w:p>
+      <w:r>
+        <w:drawing>
+          <wp:inline distT="0" distB="0" distL="0" distR="0" wp14:anchorId="6BFC848B" wp14:editId="3819B1DF">
+            <wp:extent cx="5612130" cy="2910205"/>
+            <wp:effectExtent l="0" t="0" r="7620" b="4445"/>
+            <wp:docPr id="14" name="Imagen 14"/>
+            <wp:cNvGraphicFramePr>
+              <a:graphicFrameLocks xmlns:a="http://schemas.openxmlformats.org/drawingml/2006/main" noChangeAspect="1"/>
+            </wp:cNvGraphicFramePr>
+            <a:graphic xmlns:a="http://schemas.openxmlformats.org/drawingml/2006/main">
+              <a:graphicData uri="http://schemas.openxmlformats.org/drawingml/2006/picture">
+                <pic:pic xmlns:pic="http://schemas.openxmlformats.org/drawingml/2006/picture">
+                  <pic:nvPicPr>
+                    <pic:cNvPr id="1" name=""/>
+                    <pic:cNvPicPr/>
+                  </pic:nvPicPr>
+                  <pic:blipFill>
+                    <a:blip r:embed="rId14"/>
+                    <a:stretch>
+                      <a:fillRect/>
+                    </a:stretch>
+                  </pic:blipFill>
+                  <pic:spPr>
+                    <a:xfrm>
+                      <a:off x="0" y="0"/>
+                      <a:ext cx="5612130" cy="2910205"/>
                     </a:xfrm>
                     <a:prstGeom prst="rect">
                       <a:avLst/>

</xml_diff>